<commit_message>
Update Bid and Scrapper UI
</commit_message>
<xml_diff>
--- a/json2docx/resume_template/Grant/resume.docx
+++ b/json2docx/resume_template/Grant/resume.docx
@@ -45,47 +45,7 @@
           <w:sz w:val="26"/>
           <w:szCs w:val="26"/>
         </w:rPr>
-        <w:t>&lt;&lt;Profile_</w:t>
-      </w:r>
-      <w:r>
-        <w:rPr>
-          <w:rFonts w:ascii="Aptos" w:hAnsi="Aptos" w:cstheme="minorHAnsi"/>
-          <w:b/>
-          <w:bCs/>
-          <w:sz w:val="26"/>
-          <w:szCs w:val="26"/>
-        </w:rPr>
-        <w:t>T</w:t>
-      </w:r>
-      <w:r>
-        <w:rPr>
-          <w:rFonts w:ascii="Aptos" w:hAnsi="Aptos" w:cstheme="minorHAnsi"/>
-          <w:b/>
-          <w:bCs/>
-          <w:sz w:val="26"/>
-          <w:szCs w:val="26"/>
-        </w:rPr>
-        <w:t>itle&gt;&gt; | &lt;&lt;Small_</w:t>
-      </w:r>
-      <w:r>
-        <w:rPr>
-          <w:rFonts w:ascii="Aptos" w:hAnsi="Aptos" w:cstheme="minorHAnsi"/>
-          <w:b/>
-          <w:bCs/>
-          <w:sz w:val="26"/>
-          <w:szCs w:val="26"/>
-        </w:rPr>
-        <w:t>T</w:t>
-      </w:r>
-      <w:r>
-        <w:rPr>
-          <w:rFonts w:ascii="Aptos" w:hAnsi="Aptos" w:cstheme="minorHAnsi"/>
-          <w:b/>
-          <w:bCs/>
-          <w:sz w:val="26"/>
-          <w:szCs w:val="26"/>
-        </w:rPr>
-        <w:t>itle&gt;&gt;</w:t>
+        <w:t>&lt;&lt;Profile_Title&gt;&gt; | &lt;&lt;Small_Title&gt;&gt;</w:t>
       </w:r>
     </w:p>
     <w:p>
@@ -102,144 +62,20 @@
         <w:rPr>
           <w:rFonts w:ascii="Aptos" w:hAnsi="Aptos" w:cstheme="minorHAnsi"/>
         </w:rPr>
-        <w:t>Grant.Howard124@outlook.com</w:t>
-      </w:r>
-      <w:r>
-        <w:rPr>
-          <w:rFonts w:ascii="Aptos" w:hAnsi="Aptos" w:cstheme="minorHAnsi"/>
-        </w:rPr>
-        <w:t xml:space="preserve"> </w:t>
-      </w:r>
-      <w:r>
-        <w:rPr>
-          <w:rFonts w:ascii="Aptos" w:hAnsi="Aptos" w:cstheme="minorHAnsi"/>
-        </w:rPr>
-        <w:t>|</w:t>
-      </w:r>
-      <w:r>
-        <w:rPr>
-          <w:rFonts w:ascii="Aptos" w:hAnsi="Aptos" w:cstheme="minorHAnsi"/>
-        </w:rPr>
-        <w:t xml:space="preserve"> </w:t>
-      </w:r>
-      <w:r>
-        <w:rPr>
-          <w:rFonts w:ascii="Aptos" w:hAnsi="Aptos" w:cstheme="minorHAnsi"/>
-        </w:rPr>
-        <w:t>+</w:t>
-      </w:r>
-      <w:r>
-        <w:rPr>
-          <w:rFonts w:ascii="Aptos" w:hAnsi="Aptos" w:cstheme="minorHAnsi"/>
-        </w:rPr>
-        <w:t>1</w:t>
-      </w:r>
-      <w:r>
-        <w:rPr>
-          <w:rFonts w:ascii="Aptos" w:hAnsi="Aptos" w:cstheme="minorHAnsi"/>
-        </w:rPr>
-        <w:t xml:space="preserve"> </w:t>
-      </w:r>
-      <w:r>
-        <w:rPr>
-          <w:rFonts w:ascii="Aptos" w:hAnsi="Aptos" w:cstheme="minorHAnsi"/>
-        </w:rPr>
-        <w:t>727</w:t>
-      </w:r>
-      <w:r>
-        <w:rPr>
-          <w:rFonts w:ascii="Aptos" w:hAnsi="Aptos" w:cstheme="minorHAnsi"/>
-        </w:rPr>
-        <w:t xml:space="preserve"> </w:t>
-      </w:r>
-      <w:r>
-        <w:rPr>
-          <w:rFonts w:ascii="Aptos" w:hAnsi="Aptos" w:cstheme="minorHAnsi"/>
-        </w:rPr>
-        <w:t>474</w:t>
-      </w:r>
-      <w:r>
-        <w:rPr>
-          <w:rFonts w:ascii="Aptos" w:hAnsi="Aptos" w:cstheme="minorHAnsi"/>
-        </w:rPr>
-        <w:t xml:space="preserve"> </w:t>
-      </w:r>
-      <w:r>
-        <w:rPr>
-          <w:rFonts w:ascii="Aptos" w:hAnsi="Aptos" w:cstheme="minorHAnsi"/>
-        </w:rPr>
-        <w:t>0990</w:t>
-      </w:r>
-      <w:r>
-        <w:rPr>
-          <w:rFonts w:ascii="Aptos" w:hAnsi="Aptos"/>
-        </w:rPr>
-        <w:t>‬</w:t>
-      </w:r>
-      <w:r>
-        <w:rPr>
-          <w:rFonts w:ascii="Aptos" w:hAnsi="Aptos" w:cstheme="minorHAnsi"/>
-        </w:rPr>
-        <w:t>‬</w:t>
-      </w:r>
-      <w:r>
-        <w:rPr>
-          <w:rFonts w:ascii="Aptos" w:hAnsi="Aptos" w:cstheme="minorHAnsi"/>
-        </w:rPr>
-        <w:t xml:space="preserve"> |</w:t>
-      </w:r>
-      <w:r>
-        <w:rPr>
-          <w:rFonts w:ascii="Aptos" w:hAnsi="Aptos" w:cstheme="minorHAnsi"/>
-        </w:rPr>
-        <w:t xml:space="preserve"> </w:t>
-      </w:r>
-      <w:r>
-        <w:rPr>
-          <w:rFonts w:ascii="Aptos" w:hAnsi="Aptos" w:cstheme="minorHAnsi"/>
-        </w:rPr>
-        <w:t>Bradenton</w:t>
-      </w:r>
-      <w:r>
-        <w:rPr>
-          <w:rFonts w:ascii="Aptos" w:hAnsi="Aptos" w:cstheme="minorHAnsi"/>
-        </w:rPr>
-        <w:t>, FL</w:t>
-      </w:r>
-      <w:r>
-        <w:rPr>
-          <w:rFonts w:ascii="Aptos" w:hAnsi="Aptos" w:cstheme="minorHAnsi"/>
-        </w:rPr>
-        <w:t xml:space="preserve"> | US Citizen</w:t>
-      </w:r>
-      <w:r>
-        <w:rPr>
-          <w:rFonts w:ascii="Aptos" w:hAnsi="Aptos"/>
-        </w:rPr>
-        <w:t>‬</w:t>
-      </w:r>
-      <w:r>
-        <w:t>‬</w:t>
-      </w:r>
-      <w:r>
-        <w:t>‬</w:t>
-      </w:r>
-      <w:r>
-        <w:t>‬</w:t>
-      </w:r>
-      <w:r>
-        <w:t>‬</w:t>
-      </w:r>
-      <w:r>
-        <w:t>‬</w:t>
-      </w:r>
-      <w:r>
-        <w:t>‬</w:t>
+        <w:t xml:space="preserve">Grant.Howard124@outlook.com | +1 727 474 0990</w:t>
+      </w:r>
+      <w:r>
+        <w:rPr>
+          <w:rFonts w:ascii="Aptos" w:hAnsi="Aptos" w:cstheme="minorHAnsi"/>
+        </w:rPr>
+        <w:t xml:space="preserve"> | Bradenton, FL | US Citizen</w:t>
       </w:r>
     </w:p>
     <w:p>
       <w:pPr>
         <w:pStyle w:val="Heading2"/>
+        <w:keepNext/>
+        <w:keepLines/>
         <w:pBdr>
           <w:bottom w:val="single" w:sz="4" w:space="1" w:color="auto"/>
         </w:pBdr>
@@ -267,7 +103,7 @@
     <w:p>
       <w:pPr>
         <w:spacing w:after="40"/>
-        <w:jc w:val="both"/>
+        <w:jc w:val="left"/>
         <w:rPr>
           <w:rFonts w:ascii="Aptos" w:hAnsi="Aptos" w:cstheme="minorHAnsi"/>
         </w:rPr>
@@ -282,6 +118,8 @@
     <w:p>
       <w:pPr>
         <w:pStyle w:val="Heading2"/>
+        <w:keepNext/>
+        <w:keepLines/>
         <w:pBdr>
           <w:bottom w:val="single" w:sz="4" w:space="0" w:color="auto"/>
         </w:pBdr>
@@ -305,7 +143,7 @@
     </w:p>
     <w:p>
       <w:pPr>
-        <w:jc w:val="both"/>
+        <w:jc w:val="left"/>
         <w:rPr>
           <w:rFonts w:ascii="Aptos" w:hAnsi="Aptos" w:cstheme="minorHAnsi"/>
         </w:rPr>
@@ -315,14 +153,7 @@
           <w:rFonts w:ascii="Aptos" w:hAnsi="Aptos" w:cstheme="minorHAnsi"/>
           <w:b/>
         </w:rPr>
-        <w:t>&lt;&lt;Skill-Group-1&gt;&gt;</w:t>
-      </w:r>
-      <w:r>
-        <w:rPr>
-          <w:rFonts w:ascii="Aptos" w:hAnsi="Aptos" w:cstheme="minorHAnsi"/>
-          <w:b/>
-        </w:rPr>
-        <w:t xml:space="preserve">: </w:t>
+        <w:t xml:space="preserve">&lt;&lt;Skill-Group-1&gt;&gt;: </w:t>
       </w:r>
       <w:r>
         <w:rPr>
@@ -334,7 +165,7 @@
     </w:p>
     <w:p>
       <w:pPr>
-        <w:jc w:val="both"/>
+        <w:jc w:val="left"/>
         <w:rPr>
           <w:rFonts w:ascii="Aptos" w:hAnsi="Aptos" w:cstheme="minorHAnsi"/>
         </w:rPr>
@@ -344,47 +175,19 @@
           <w:rFonts w:ascii="Aptos" w:hAnsi="Aptos" w:cstheme="minorHAnsi"/>
           <w:b/>
         </w:rPr>
-        <w:t>&lt;&lt;Skill-Group-</w:t>
-      </w:r>
-      <w:r>
-        <w:rPr>
-          <w:rFonts w:ascii="Aptos" w:hAnsi="Aptos" w:cstheme="minorHAnsi"/>
-          <w:b/>
-        </w:rPr>
-        <w:t>2</w:t>
-      </w:r>
-      <w:r>
-        <w:rPr>
-          <w:rFonts w:ascii="Aptos" w:hAnsi="Aptos" w:cstheme="minorHAnsi"/>
-          <w:b/>
-        </w:rPr>
-        <w:t xml:space="preserve">&gt;&gt;: </w:t>
+        <w:t xml:space="preserve">&lt;&lt;Skill-Group-2&gt;&gt;: </w:t>
       </w:r>
       <w:r>
         <w:rPr>
           <w:rFonts w:ascii="Aptos" w:hAnsi="Aptos" w:cstheme="minorHAnsi"/>
           <w:bCs/>
         </w:rPr>
-        <w:t>&lt;&lt;Skill-Items-</w:t>
-      </w:r>
-      <w:r>
-        <w:rPr>
-          <w:rFonts w:ascii="Aptos" w:hAnsi="Aptos" w:cstheme="minorHAnsi"/>
-          <w:bCs/>
-        </w:rPr>
-        <w:t>2</w:t>
-      </w:r>
-      <w:r>
-        <w:rPr>
-          <w:rFonts w:ascii="Aptos" w:hAnsi="Aptos" w:cstheme="minorHAnsi"/>
-          <w:bCs/>
-        </w:rPr>
-        <w:t>&gt;&gt;</w:t>
+        <w:t>&lt;&lt;Skill-Items-2&gt;&gt;</w:t>
       </w:r>
     </w:p>
     <w:p>
       <w:pPr>
-        <w:jc w:val="both"/>
+        <w:jc w:val="left"/>
         <w:rPr>
           <w:rFonts w:ascii="Aptos" w:hAnsi="Aptos" w:cstheme="minorHAnsi"/>
         </w:rPr>
@@ -394,47 +197,19 @@
           <w:rFonts w:ascii="Aptos" w:hAnsi="Aptos" w:cstheme="minorHAnsi"/>
           <w:b/>
         </w:rPr>
-        <w:t>&lt;&lt;Skill-Group-</w:t>
-      </w:r>
-      <w:r>
-        <w:rPr>
-          <w:rFonts w:ascii="Aptos" w:hAnsi="Aptos" w:cstheme="minorHAnsi"/>
-          <w:b/>
-        </w:rPr>
-        <w:t>3</w:t>
-      </w:r>
-      <w:r>
-        <w:rPr>
-          <w:rFonts w:ascii="Aptos" w:hAnsi="Aptos" w:cstheme="minorHAnsi"/>
-          <w:b/>
-        </w:rPr>
-        <w:t xml:space="preserve">&gt;&gt;: </w:t>
+        <w:t xml:space="preserve">&lt;&lt;Skill-Group-3&gt;&gt;: </w:t>
       </w:r>
       <w:r>
         <w:rPr>
           <w:rFonts w:ascii="Aptos" w:hAnsi="Aptos" w:cstheme="minorHAnsi"/>
           <w:bCs/>
         </w:rPr>
-        <w:t>&lt;&lt;Skill-Items-</w:t>
-      </w:r>
-      <w:r>
-        <w:rPr>
-          <w:rFonts w:ascii="Aptos" w:hAnsi="Aptos" w:cstheme="minorHAnsi"/>
-          <w:bCs/>
-        </w:rPr>
-        <w:t>3</w:t>
-      </w:r>
-      <w:r>
-        <w:rPr>
-          <w:rFonts w:ascii="Aptos" w:hAnsi="Aptos" w:cstheme="minorHAnsi"/>
-          <w:bCs/>
-        </w:rPr>
-        <w:t>&gt;&gt;</w:t>
+        <w:t>&lt;&lt;Skill-Items-3&gt;&gt;</w:t>
       </w:r>
     </w:p>
     <w:p>
       <w:pPr>
-        <w:jc w:val="both"/>
+        <w:jc w:val="left"/>
         <w:rPr>
           <w:rFonts w:ascii="Aptos" w:hAnsi="Aptos" w:cstheme="minorHAnsi"/>
         </w:rPr>
@@ -444,47 +219,19 @@
           <w:rFonts w:ascii="Aptos" w:hAnsi="Aptos" w:cstheme="minorHAnsi"/>
           <w:b/>
         </w:rPr>
-        <w:t>&lt;&lt;Skill-Group-</w:t>
-      </w:r>
-      <w:r>
-        <w:rPr>
-          <w:rFonts w:ascii="Aptos" w:hAnsi="Aptos" w:cstheme="minorHAnsi"/>
-          <w:b/>
-        </w:rPr>
-        <w:t>4</w:t>
-      </w:r>
-      <w:r>
-        <w:rPr>
-          <w:rFonts w:ascii="Aptos" w:hAnsi="Aptos" w:cstheme="minorHAnsi"/>
-          <w:b/>
-        </w:rPr>
-        <w:t xml:space="preserve">&gt;&gt;: </w:t>
+        <w:t xml:space="preserve">&lt;&lt;Skill-Group-4&gt;&gt;: </w:t>
       </w:r>
       <w:r>
         <w:rPr>
           <w:rFonts w:ascii="Aptos" w:hAnsi="Aptos" w:cstheme="minorHAnsi"/>
           <w:bCs/>
         </w:rPr>
-        <w:t>&lt;&lt;Skill-Items-</w:t>
-      </w:r>
-      <w:r>
-        <w:rPr>
-          <w:rFonts w:ascii="Aptos" w:hAnsi="Aptos" w:cstheme="minorHAnsi"/>
-          <w:bCs/>
-        </w:rPr>
-        <w:t>4</w:t>
-      </w:r>
-      <w:r>
-        <w:rPr>
-          <w:rFonts w:ascii="Aptos" w:hAnsi="Aptos" w:cstheme="minorHAnsi"/>
-          <w:bCs/>
-        </w:rPr>
-        <w:t>&gt;&gt;</w:t>
+        <w:t>&lt;&lt;Skill-Items-4&gt;&gt;</w:t>
       </w:r>
     </w:p>
     <w:p>
       <w:pPr>
-        <w:jc w:val="both"/>
+        <w:jc w:val="left"/>
         <w:rPr>
           <w:rFonts w:ascii="Aptos" w:hAnsi="Aptos" w:cstheme="minorHAnsi"/>
         </w:rPr>
@@ -494,47 +241,19 @@
           <w:rFonts w:ascii="Aptos" w:hAnsi="Aptos" w:cstheme="minorHAnsi"/>
           <w:b/>
         </w:rPr>
-        <w:t>&lt;&lt;Skill-Group-</w:t>
-      </w:r>
-      <w:r>
-        <w:rPr>
-          <w:rFonts w:ascii="Aptos" w:hAnsi="Aptos" w:cstheme="minorHAnsi"/>
-          <w:b/>
-        </w:rPr>
-        <w:t>5</w:t>
-      </w:r>
-      <w:r>
-        <w:rPr>
-          <w:rFonts w:ascii="Aptos" w:hAnsi="Aptos" w:cstheme="minorHAnsi"/>
-          <w:b/>
-        </w:rPr>
-        <w:t xml:space="preserve">&gt;&gt;: </w:t>
+        <w:t xml:space="preserve">&lt;&lt;Skill-Group-5&gt;&gt;: </w:t>
       </w:r>
       <w:r>
         <w:rPr>
           <w:rFonts w:ascii="Aptos" w:hAnsi="Aptos" w:cstheme="minorHAnsi"/>
           <w:bCs/>
         </w:rPr>
-        <w:t>&lt;&lt;Skill-Items-</w:t>
-      </w:r>
-      <w:r>
-        <w:rPr>
-          <w:rFonts w:ascii="Aptos" w:hAnsi="Aptos" w:cstheme="minorHAnsi"/>
-          <w:bCs/>
-        </w:rPr>
-        <w:t>5</w:t>
-      </w:r>
-      <w:r>
-        <w:rPr>
-          <w:rFonts w:ascii="Aptos" w:hAnsi="Aptos" w:cstheme="minorHAnsi"/>
-          <w:bCs/>
-        </w:rPr>
-        <w:t>&gt;&gt;</w:t>
+        <w:t>&lt;&lt;Skill-Items-5&gt;&gt;</w:t>
       </w:r>
     </w:p>
     <w:p>
       <w:pPr>
-        <w:jc w:val="both"/>
+        <w:jc w:val="left"/>
         <w:rPr>
           <w:rFonts w:ascii="Aptos" w:hAnsi="Aptos" w:cstheme="minorHAnsi"/>
           <w:bCs/>
@@ -545,47 +264,21 @@
           <w:rFonts w:ascii="Aptos" w:hAnsi="Aptos" w:cstheme="minorHAnsi"/>
           <w:b/>
         </w:rPr>
-        <w:t>&lt;&lt;Skill-Group-</w:t>
-      </w:r>
-      <w:r>
-        <w:rPr>
-          <w:rFonts w:ascii="Aptos" w:hAnsi="Aptos" w:cstheme="minorHAnsi"/>
-          <w:b/>
-        </w:rPr>
-        <w:t>6</w:t>
-      </w:r>
-      <w:r>
-        <w:rPr>
-          <w:rFonts w:ascii="Aptos" w:hAnsi="Aptos" w:cstheme="minorHAnsi"/>
-          <w:b/>
-        </w:rPr>
-        <w:t xml:space="preserve">&gt;&gt;: </w:t>
+        <w:t xml:space="preserve">&lt;&lt;Skill-Group-6&gt;&gt;: </w:t>
       </w:r>
       <w:r>
         <w:rPr>
           <w:rFonts w:ascii="Aptos" w:hAnsi="Aptos" w:cstheme="minorHAnsi"/>
           <w:bCs/>
         </w:rPr>
-        <w:t>&lt;&lt;Skill-Items-</w:t>
-      </w:r>
-      <w:r>
-        <w:rPr>
-          <w:rFonts w:ascii="Aptos" w:hAnsi="Aptos" w:cstheme="minorHAnsi"/>
-          <w:bCs/>
-        </w:rPr>
-        <w:t>6</w:t>
-      </w:r>
-      <w:r>
-        <w:rPr>
-          <w:rFonts w:ascii="Aptos" w:hAnsi="Aptos" w:cstheme="minorHAnsi"/>
-          <w:bCs/>
-        </w:rPr>
-        <w:t>&gt;&gt;</w:t>
+        <w:t>&lt;&lt;Skill-Items-6&gt;&gt;</w:t>
       </w:r>
     </w:p>
     <w:p>
       <w:pPr>
         <w:pStyle w:val="Heading2"/>
+        <w:keepNext/>
+        <w:keepLines/>
         <w:pBdr>
           <w:bottom w:val="single" w:sz="4" w:space="0" w:color="auto"/>
         </w:pBdr>
@@ -604,52 +297,28 @@
           <w:bCs/>
           <w:color w:val="auto"/>
         </w:rPr>
-        <w:t>WORK</w:t>
-      </w:r>
+        <w:t xml:space="preserve">WORK EXPERIENCE</w:t>
+      </w:r>
+    </w:p>
+    <w:p>
+      <w:pPr>
+        <w:keepNext/>
+        <w:keepLines/>
+        <w:tabs>
+          <w:tab w:val="right" w:pos="10754"/>
+        </w:tabs>
+        <w:spacing w:before="60" w:after="60"/>
+        <w:rPr>
+          <w:rFonts w:ascii="Aptos" w:hAnsi="Aptos" w:cstheme="minorHAnsi"/>
+        </w:rPr>
+      </w:pPr>
       <w:r>
         <w:rPr>
           <w:rFonts w:ascii="Aptos" w:hAnsi="Aptos" w:cstheme="minorHAnsi"/>
           <w:b/>
           <w:bCs/>
-          <w:color w:val="auto"/>
-        </w:rPr>
-        <w:t xml:space="preserve"> </w:t>
-      </w:r>
-      <w:r>
-        <w:rPr>
-          <w:rFonts w:ascii="Aptos" w:hAnsi="Aptos" w:cstheme="minorHAnsi"/>
-          <w:b/>
-          <w:bCs/>
-          <w:color w:val="auto"/>
-        </w:rPr>
-        <w:t>EXPERIENCE</w:t>
-      </w:r>
-    </w:p>
-    <w:p>
-      <w:pPr>
-        <w:tabs>
-          <w:tab w:val="right" w:pos="10800"/>
-        </w:tabs>
-        <w:spacing w:before="60" w:after="60"/>
-        <w:rPr>
-          <w:rFonts w:ascii="Aptos" w:hAnsi="Aptos" w:cstheme="minorHAnsi"/>
-        </w:rPr>
-      </w:pPr>
-      <w:r>
-        <w:rPr>
-          <w:rFonts w:ascii="Aptos" w:hAnsi="Aptos" w:cstheme="minorHAnsi"/>
-          <w:b/>
-          <w:bCs/>
-        </w:rPr>
-        <w:t>Senior Software Engineer</w:t>
-      </w:r>
-      <w:r>
-        <w:rPr>
-          <w:rFonts w:ascii="Aptos" w:hAnsi="Aptos" w:cstheme="minorHAnsi"/>
-          <w:b/>
-          <w:bCs/>
-        </w:rPr>
-        <w:t xml:space="preserve"> (</w:t>
+        </w:rPr>
+        <w:t xml:space="preserve">Senior Software Engineer (</w:t>
       </w:r>
       <w:r>
         <w:rPr>
@@ -679,49 +348,7 @@
           <w:rFonts w:ascii="Aptos" w:hAnsi="Aptos" w:cstheme="minorHAnsi"/>
           <w:color w:val="404040" w:themeColor="text1" w:themeTint="BF"/>
         </w:rPr>
-        <w:t>Nov</w:t>
-      </w:r>
-      <w:r>
-        <w:rPr>
-          <w:rFonts w:ascii="Aptos" w:hAnsi="Aptos" w:cstheme="minorHAnsi"/>
-          <w:color w:val="404040" w:themeColor="text1" w:themeTint="BF"/>
-        </w:rPr>
-        <w:t xml:space="preserve"> 202</w:t>
-      </w:r>
-      <w:r>
-        <w:rPr>
-          <w:rFonts w:ascii="Aptos" w:hAnsi="Aptos" w:cstheme="minorHAnsi"/>
-          <w:color w:val="404040" w:themeColor="text1" w:themeTint="BF"/>
-        </w:rPr>
-        <w:t>2</w:t>
-      </w:r>
-      <w:r>
-        <w:rPr>
-          <w:rFonts w:ascii="Aptos" w:hAnsi="Aptos" w:cstheme="minorHAnsi"/>
-          <w:color w:val="404040" w:themeColor="text1" w:themeTint="BF"/>
-        </w:rPr>
-        <w:t xml:space="preserve"> –</w:t>
-      </w:r>
-      <w:r>
-        <w:rPr>
-          <w:rFonts w:ascii="Aptos" w:hAnsi="Aptos" w:cstheme="minorHAnsi"/>
-          <w:color w:val="404040" w:themeColor="text1" w:themeTint="BF"/>
-        </w:rPr>
-        <w:t xml:space="preserve"> </w:t>
-      </w:r>
-      <w:r>
-        <w:rPr>
-          <w:rFonts w:ascii="Aptos" w:hAnsi="Aptos" w:cstheme="minorHAnsi"/>
-          <w:color w:val="404040" w:themeColor="text1" w:themeTint="BF"/>
-        </w:rPr>
-        <w:t>Aug</w:t>
-      </w:r>
-      <w:r>
-        <w:rPr>
-          <w:rFonts w:ascii="Aptos" w:hAnsi="Aptos" w:cstheme="minorHAnsi"/>
-          <w:color w:val="404040" w:themeColor="text1" w:themeTint="BF"/>
-        </w:rPr>
-        <w:t xml:space="preserve"> 2026</w:t>
+        <w:t xml:space="preserve">Nov 2022 – Aug 2026</w:t>
       </w:r>
       <w:r>
         <w:rPr>
@@ -750,20 +377,15 @@
           <w:rFonts w:ascii="Aptos" w:hAnsi="Aptos" w:cstheme="minorHAnsi"/>
           <w:color w:val="404040" w:themeColor="text1" w:themeTint="BF"/>
         </w:rPr>
-        <w:t>&lt;&lt;Company-Location-1&gt;&gt;</w:t>
-      </w:r>
-      <w:r>
-        <w:rPr>
-          <w:rFonts w:ascii="Aptos" w:hAnsi="Aptos" w:cstheme="minorHAnsi"/>
-          <w:color w:val="404040" w:themeColor="text1" w:themeTint="BF"/>
-        </w:rPr>
-        <w:t xml:space="preserve"> (Remote)</w:t>
+        <w:t xml:space="preserve">&lt;&lt;Company-Location-1&gt;&gt; (Remote)</w:t>
       </w:r>
     </w:p>
     <w:p>
       <w:pPr>
+        <w:keepNext/>
+        <w:keepLines/>
         <w:spacing w:beforeLines="20" w:before="48" w:afterLines="20" w:after="48"/>
-        <w:jc w:val="both"/>
+        <w:jc w:val="left"/>
         <w:rPr>
           <w:rFonts w:ascii="Aptos" w:hAnsi="Aptos" w:cstheme="minorHAnsi"/>
           <w:i/>
@@ -784,204 +406,140 @@
     <w:p>
       <w:pPr>
         <w:pStyle w:val="ListParagraph"/>
+        <w:keepLines/>
         <w:numPr>
           <w:ilvl w:val="0"/>
           <w:numId w:val="14"/>
         </w:numPr>
         <w:ind w:left="180" w:hanging="180"/>
-        <w:jc w:val="both"/>
-        <w:rPr>
-          <w:rFonts w:ascii="Aptos" w:hAnsi="Aptos" w:cstheme="minorHAnsi"/>
-        </w:rPr>
-      </w:pPr>
-      <w:r>
-        <w:rPr>
-          <w:rFonts w:ascii="Aptos" w:hAnsi="Aptos" w:cstheme="minorHAnsi"/>
-        </w:rPr>
-        <w:t>&lt;&lt;Bullet-</w:t>
-      </w:r>
-      <w:r>
-        <w:rPr>
-          <w:rFonts w:ascii="Aptos" w:hAnsi="Aptos" w:cstheme="minorHAnsi"/>
-        </w:rPr>
-        <w:t>1</w:t>
-      </w:r>
-      <w:r>
-        <w:rPr>
-          <w:rFonts w:ascii="Aptos" w:hAnsi="Aptos" w:cstheme="minorHAnsi"/>
-        </w:rPr>
-        <w:t>-1&gt;&gt;</w:t>
+        <w:jc w:val="left"/>
+        <w:rPr>
+          <w:rFonts w:ascii="Aptos" w:hAnsi="Aptos" w:cstheme="minorHAnsi"/>
+        </w:rPr>
+      </w:pPr>
+      <w:r>
+        <w:rPr>
+          <w:rFonts w:ascii="Aptos" w:hAnsi="Aptos" w:cstheme="minorHAnsi"/>
+        </w:rPr>
+        <w:t>&lt;&lt;Bullet-1-1&gt;&gt;</w:t>
       </w:r>
     </w:p>
     <w:p>
       <w:pPr>
         <w:pStyle w:val="ListParagraph"/>
+        <w:keepLines/>
         <w:numPr>
           <w:ilvl w:val="0"/>
           <w:numId w:val="14"/>
         </w:numPr>
         <w:ind w:left="180" w:hanging="180"/>
-        <w:jc w:val="both"/>
-        <w:rPr>
-          <w:rFonts w:ascii="Aptos" w:hAnsi="Aptos" w:cstheme="minorHAnsi"/>
-        </w:rPr>
-      </w:pPr>
-      <w:r>
-        <w:rPr>
-          <w:rFonts w:ascii="Aptos" w:hAnsi="Aptos" w:cstheme="minorHAnsi"/>
-        </w:rPr>
-        <w:t>&lt;&lt;Bullet-</w:t>
-      </w:r>
-      <w:r>
-        <w:rPr>
-          <w:rFonts w:ascii="Aptos" w:hAnsi="Aptos" w:cstheme="minorHAnsi"/>
-        </w:rPr>
-        <w:t>1</w:t>
-      </w:r>
-      <w:r>
-        <w:rPr>
-          <w:rFonts w:ascii="Aptos" w:hAnsi="Aptos" w:cstheme="minorHAnsi"/>
-        </w:rPr>
-        <w:t>-2&gt;&gt;</w:t>
+        <w:jc w:val="left"/>
+        <w:rPr>
+          <w:rFonts w:ascii="Aptos" w:hAnsi="Aptos" w:cstheme="minorHAnsi"/>
+        </w:rPr>
+      </w:pPr>
+      <w:r>
+        <w:rPr>
+          <w:rFonts w:ascii="Aptos" w:hAnsi="Aptos" w:cstheme="minorHAnsi"/>
+        </w:rPr>
+        <w:t>&lt;&lt;Bullet-1-2&gt;&gt;</w:t>
       </w:r>
     </w:p>
     <w:p>
       <w:pPr>
         <w:pStyle w:val="ListParagraph"/>
+        <w:keepLines/>
         <w:numPr>
           <w:ilvl w:val="0"/>
           <w:numId w:val="14"/>
         </w:numPr>
         <w:ind w:left="180" w:hanging="180"/>
-        <w:jc w:val="both"/>
-        <w:rPr>
-          <w:rFonts w:ascii="Aptos" w:hAnsi="Aptos" w:cstheme="minorHAnsi"/>
-        </w:rPr>
-      </w:pPr>
-      <w:r>
-        <w:rPr>
-          <w:rFonts w:ascii="Aptos" w:hAnsi="Aptos" w:cstheme="minorHAnsi"/>
-        </w:rPr>
-        <w:t>&lt;&lt;Bullet-</w:t>
-      </w:r>
-      <w:r>
-        <w:rPr>
-          <w:rFonts w:ascii="Aptos" w:hAnsi="Aptos" w:cstheme="minorHAnsi"/>
-        </w:rPr>
-        <w:t>1</w:t>
-      </w:r>
-      <w:r>
-        <w:rPr>
-          <w:rFonts w:ascii="Aptos" w:hAnsi="Aptos" w:cstheme="minorHAnsi"/>
-        </w:rPr>
-        <w:t>-3&gt;&gt;</w:t>
+        <w:jc w:val="left"/>
+        <w:rPr>
+          <w:rFonts w:ascii="Aptos" w:hAnsi="Aptos" w:cstheme="minorHAnsi"/>
+        </w:rPr>
+      </w:pPr>
+      <w:r>
+        <w:rPr>
+          <w:rFonts w:ascii="Aptos" w:hAnsi="Aptos" w:cstheme="minorHAnsi"/>
+        </w:rPr>
+        <w:t>&lt;&lt;Bullet-1-3&gt;&gt;</w:t>
       </w:r>
     </w:p>
     <w:p>
       <w:pPr>
         <w:pStyle w:val="ListParagraph"/>
+        <w:keepLines/>
         <w:numPr>
           <w:ilvl w:val="0"/>
           <w:numId w:val="14"/>
         </w:numPr>
         <w:ind w:left="180" w:hanging="180"/>
-        <w:jc w:val="both"/>
-        <w:rPr>
-          <w:rFonts w:ascii="Aptos" w:hAnsi="Aptos" w:cstheme="minorHAnsi"/>
-        </w:rPr>
-      </w:pPr>
-      <w:r>
-        <w:rPr>
-          <w:rFonts w:ascii="Aptos" w:hAnsi="Aptos" w:cstheme="minorHAnsi"/>
-        </w:rPr>
-        <w:t>&lt;&lt;Bullet-</w:t>
-      </w:r>
-      <w:r>
-        <w:rPr>
-          <w:rFonts w:ascii="Aptos" w:hAnsi="Aptos" w:cstheme="minorHAnsi"/>
-        </w:rPr>
-        <w:t>1</w:t>
-      </w:r>
-      <w:r>
-        <w:rPr>
-          <w:rFonts w:ascii="Aptos" w:hAnsi="Aptos" w:cstheme="minorHAnsi"/>
-        </w:rPr>
-        <w:t>-4&gt;&gt;</w:t>
+        <w:jc w:val="left"/>
+        <w:rPr>
+          <w:rFonts w:ascii="Aptos" w:hAnsi="Aptos" w:cstheme="minorHAnsi"/>
+        </w:rPr>
+      </w:pPr>
+      <w:r>
+        <w:rPr>
+          <w:rFonts w:ascii="Aptos" w:hAnsi="Aptos" w:cstheme="minorHAnsi"/>
+        </w:rPr>
+        <w:t>&lt;&lt;Bullet-1-4&gt;&gt;</w:t>
       </w:r>
     </w:p>
     <w:p>
       <w:pPr>
         <w:pStyle w:val="ListParagraph"/>
+        <w:keepLines/>
         <w:numPr>
           <w:ilvl w:val="0"/>
           <w:numId w:val="14"/>
         </w:numPr>
         <w:ind w:left="180" w:hanging="180"/>
-        <w:jc w:val="both"/>
-        <w:rPr>
-          <w:rFonts w:ascii="Aptos" w:hAnsi="Aptos" w:cstheme="minorHAnsi"/>
-        </w:rPr>
-      </w:pPr>
-      <w:r>
-        <w:rPr>
-          <w:rFonts w:ascii="Aptos" w:hAnsi="Aptos" w:cstheme="minorHAnsi"/>
-        </w:rPr>
-        <w:t>&lt;&lt;Bullet-</w:t>
-      </w:r>
-      <w:r>
-        <w:rPr>
-          <w:rFonts w:ascii="Aptos" w:hAnsi="Aptos" w:cstheme="minorHAnsi"/>
-        </w:rPr>
-        <w:t>1</w:t>
-      </w:r>
-      <w:r>
-        <w:rPr>
-          <w:rFonts w:ascii="Aptos" w:hAnsi="Aptos" w:cstheme="minorHAnsi"/>
-        </w:rPr>
-        <w:t>-5&gt;&gt;</w:t>
+        <w:jc w:val="left"/>
+        <w:rPr>
+          <w:rFonts w:ascii="Aptos" w:hAnsi="Aptos" w:cstheme="minorHAnsi"/>
+        </w:rPr>
+      </w:pPr>
+      <w:r>
+        <w:rPr>
+          <w:rFonts w:ascii="Aptos" w:hAnsi="Aptos" w:cstheme="minorHAnsi"/>
+        </w:rPr>
+        <w:t>&lt;&lt;Bullet-1-5&gt;&gt;</w:t>
       </w:r>
     </w:p>
     <w:p>
       <w:pPr>
         <w:pStyle w:val="ListParagraph"/>
+        <w:keepLines/>
         <w:numPr>
           <w:ilvl w:val="0"/>
           <w:numId w:val="14"/>
         </w:numPr>
         <w:ind w:left="180" w:hanging="180"/>
-        <w:jc w:val="both"/>
-        <w:rPr>
-          <w:rFonts w:ascii="Aptos" w:hAnsi="Aptos" w:cstheme="minorHAnsi"/>
-        </w:rPr>
-      </w:pPr>
-      <w:r>
-        <w:rPr>
-          <w:rFonts w:ascii="Aptos" w:hAnsi="Aptos" w:cstheme="minorHAnsi"/>
-        </w:rPr>
-        <w:t>&lt;&lt;Bullet-1-</w:t>
-      </w:r>
-      <w:r>
-        <w:rPr>
-          <w:rFonts w:ascii="Aptos" w:hAnsi="Aptos" w:cstheme="minorHAnsi"/>
-        </w:rPr>
-        <w:t>6</w:t>
-      </w:r>
-      <w:r>
-        <w:rPr>
-          <w:rFonts w:ascii="Aptos" w:hAnsi="Aptos" w:cstheme="minorHAnsi"/>
-        </w:rPr>
-        <w:t>&gt;&gt;</w:t>
+        <w:jc w:val="left"/>
+        <w:rPr>
+          <w:rFonts w:ascii="Aptos" w:hAnsi="Aptos" w:cstheme="minorHAnsi"/>
+        </w:rPr>
+      </w:pPr>
+      <w:r>
+        <w:rPr>
+          <w:rFonts w:ascii="Aptos" w:hAnsi="Aptos" w:cstheme="minorHAnsi"/>
+        </w:rPr>
+        <w:t>&lt;&lt;Bullet-1-6&gt;&gt;</w:t>
       </w:r>
     </w:p>
     <w:p>
       <w:pPr>
         <w:pStyle w:val="ListParagraph"/>
+        <w:keepNext/>
+        <w:keepLines/>
         <w:numPr>
           <w:ilvl w:val="0"/>
           <w:numId w:val="14"/>
         </w:numPr>
         <w:ind w:left="180" w:hanging="180"/>
-        <w:jc w:val="both"/>
+        <w:jc w:val="left"/>
         <w:rPr>
           <w:rFonts w:ascii="Aptos" w:hAnsi="Aptos" w:cstheme="minorHAnsi"/>
         </w:rPr>
@@ -995,8 +553,9 @@
     </w:p>
     <w:p>
       <w:pPr>
+        <w:keepLines/>
         <w:spacing w:beforeLines="20" w:before="48" w:afterLines="20" w:after="48"/>
-        <w:jc w:val="both"/>
+        <w:jc w:val="left"/>
         <w:rPr>
           <w:rFonts w:ascii="Aptos" w:hAnsi="Aptos" w:cstheme="minorHAnsi"/>
         </w:rPr>
@@ -1013,25 +572,15 @@
         <w:rPr>
           <w:rFonts w:ascii="Aptos" w:hAnsi="Aptos" w:cstheme="minorHAnsi"/>
         </w:rPr>
-        <w:t>: &lt;&lt;</w:t>
-      </w:r>
-      <w:r>
-        <w:rPr>
-          <w:rFonts w:ascii="Aptos" w:hAnsi="Aptos" w:cstheme="minorHAnsi"/>
-        </w:rPr>
-        <w:t>Technologies</w:t>
-      </w:r>
-      <w:r>
-        <w:rPr>
-          <w:rFonts w:ascii="Aptos" w:hAnsi="Aptos" w:cstheme="minorHAnsi"/>
-        </w:rPr>
-        <w:t>-1&gt;&gt;</w:t>
+        <w:t>: &lt;&lt;Technologies-1&gt;&gt;</w:t>
       </w:r>
     </w:p>
     <w:p>
       <w:pPr>
+        <w:keepNext/>
+        <w:keepLines/>
         <w:tabs>
-          <w:tab w:val="right" w:pos="10800"/>
+          <w:tab w:val="right" w:pos="10754"/>
         </w:tabs>
         <w:spacing w:before="160" w:after="60"/>
         <w:rPr>
@@ -1044,31 +593,7 @@
           <w:b/>
           <w:bCs/>
         </w:rPr>
-        <w:t xml:space="preserve">Software </w:t>
-      </w:r>
-      <w:r>
-        <w:rPr>
-          <w:rFonts w:ascii="Aptos" w:hAnsi="Aptos" w:cstheme="minorHAnsi"/>
-          <w:b/>
-          <w:bCs/>
-        </w:rPr>
-        <w:t xml:space="preserve">Engineer </w:t>
-      </w:r>
-      <w:r>
-        <w:rPr>
-          <w:rFonts w:ascii="Aptos" w:hAnsi="Aptos" w:cstheme="minorHAnsi"/>
-          <w:b/>
-          <w:bCs/>
-        </w:rPr>
-        <w:t xml:space="preserve">II </w:t>
-      </w:r>
-      <w:r>
-        <w:rPr>
-          <w:rFonts w:ascii="Aptos" w:hAnsi="Aptos" w:cstheme="minorHAnsi"/>
-          <w:b/>
-          <w:bCs/>
-        </w:rPr>
-        <w:t>(</w:t>
+        <w:t xml:space="preserve">Software Engineer II (</w:t>
       </w:r>
       <w:r>
         <w:rPr>
@@ -1077,95 +602,28 @@
           <w:bCs/>
           <w:color w:val="404040" w:themeColor="text1" w:themeTint="BF"/>
         </w:rPr>
-        <w:t>&lt;&lt;Extra-Role-Title-</w:t>
+        <w:t>&lt;&lt;Extra-Role-Title-2&gt;&gt;</w:t>
       </w:r>
       <w:r>
         <w:rPr>
           <w:rFonts w:ascii="Aptos" w:hAnsi="Aptos" w:cstheme="minorHAnsi"/>
           <w:b/>
           <w:bCs/>
+        </w:rPr>
+        <w:t>)</w:t>
+      </w:r>
+      <w:r>
+        <w:rPr>
+          <w:rFonts w:ascii="Aptos" w:hAnsi="Aptos" w:cstheme="minorHAnsi"/>
+        </w:rPr>
+        <w:tab/>
+      </w:r>
+      <w:r>
+        <w:rPr>
+          <w:rFonts w:ascii="Aptos" w:hAnsi="Aptos" w:cstheme="minorHAnsi"/>
           <w:color w:val="404040" w:themeColor="text1" w:themeTint="BF"/>
         </w:rPr>
-        <w:t>2</w:t>
-      </w:r>
-      <w:r>
-        <w:rPr>
-          <w:rFonts w:ascii="Aptos" w:hAnsi="Aptos" w:cstheme="minorHAnsi"/>
-          <w:b/>
-          <w:bCs/>
-          <w:color w:val="404040" w:themeColor="text1" w:themeTint="BF"/>
-        </w:rPr>
-        <w:t>&gt;&gt;</w:t>
-      </w:r>
-      <w:r>
-        <w:rPr>
-          <w:rFonts w:ascii="Aptos" w:hAnsi="Aptos" w:cstheme="minorHAnsi"/>
-          <w:b/>
-          <w:bCs/>
-        </w:rPr>
-        <w:t>)</w:t>
-      </w:r>
-      <w:r>
-        <w:rPr>
-          <w:rFonts w:ascii="Aptos" w:hAnsi="Aptos" w:cstheme="minorHAnsi"/>
-        </w:rPr>
-        <w:tab/>
-      </w:r>
-      <w:r>
-        <w:rPr>
-          <w:rFonts w:ascii="Aptos" w:hAnsi="Aptos" w:cstheme="minorHAnsi"/>
-          <w:color w:val="404040" w:themeColor="text1" w:themeTint="BF"/>
-        </w:rPr>
-        <w:t>Apr</w:t>
-      </w:r>
-      <w:r>
-        <w:rPr>
-          <w:rFonts w:ascii="Aptos" w:hAnsi="Aptos" w:cstheme="minorHAnsi"/>
-          <w:color w:val="404040" w:themeColor="text1" w:themeTint="BF"/>
-        </w:rPr>
-        <w:t xml:space="preserve"> 20</w:t>
-      </w:r>
-      <w:r>
-        <w:rPr>
-          <w:rFonts w:ascii="Aptos" w:hAnsi="Aptos" w:cstheme="minorHAnsi"/>
-          <w:color w:val="404040" w:themeColor="text1" w:themeTint="BF"/>
-        </w:rPr>
-        <w:t>20</w:t>
-      </w:r>
-      <w:r>
-        <w:rPr>
-          <w:rFonts w:ascii="Aptos" w:hAnsi="Aptos" w:cstheme="minorHAnsi"/>
-          <w:color w:val="404040" w:themeColor="text1" w:themeTint="BF"/>
-        </w:rPr>
-        <w:t xml:space="preserve"> </w:t>
-      </w:r>
-      <w:r>
-        <w:rPr>
-          <w:rFonts w:ascii="Aptos" w:hAnsi="Aptos" w:cstheme="minorHAnsi"/>
-          <w:color w:val="404040" w:themeColor="text1" w:themeTint="BF"/>
-        </w:rPr>
-        <w:t xml:space="preserve">– </w:t>
-      </w:r>
-      <w:r>
-        <w:rPr>
-          <w:rFonts w:ascii="Aptos" w:hAnsi="Aptos" w:cstheme="minorHAnsi"/>
-          <w:color w:val="404040" w:themeColor="text1" w:themeTint="BF"/>
-        </w:rPr>
-        <w:t>Oct</w:t>
-      </w:r>
-      <w:r>
-        <w:rPr>
-          <w:rFonts w:ascii="Aptos" w:hAnsi="Aptos" w:cstheme="minorHAnsi"/>
-          <w:color w:val="404040" w:themeColor="text1" w:themeTint="BF"/>
-        </w:rPr>
-        <w:t xml:space="preserve"> 202</w:t>
-      </w:r>
-      <w:r>
-        <w:rPr>
-          <w:rFonts w:ascii="Aptos" w:hAnsi="Aptos" w:cstheme="minorHAnsi"/>
-          <w:color w:val="404040" w:themeColor="text1" w:themeTint="BF"/>
-        </w:rPr>
-        <w:t>2</w:t>
+        <w:t xml:space="preserve">Apr 2020 – Oct 2022</w:t>
       </w:r>
       <w:r>
         <w:rPr>
@@ -1194,34 +652,15 @@
           <w:rFonts w:ascii="Aptos" w:hAnsi="Aptos" w:cstheme="minorHAnsi"/>
           <w:color w:val="404040" w:themeColor="text1" w:themeTint="BF"/>
         </w:rPr>
-        <w:t>&lt;&lt;Company-Location-</w:t>
-      </w:r>
-      <w:r>
-        <w:rPr>
-          <w:rFonts w:ascii="Aptos" w:hAnsi="Aptos" w:cstheme="minorHAnsi"/>
-          <w:color w:val="404040" w:themeColor="text1" w:themeTint="BF"/>
-        </w:rPr>
-        <w:t>2</w:t>
-      </w:r>
-      <w:r>
-        <w:rPr>
-          <w:rFonts w:ascii="Aptos" w:hAnsi="Aptos" w:cstheme="minorHAnsi"/>
-          <w:color w:val="404040" w:themeColor="text1" w:themeTint="BF"/>
-        </w:rPr>
-        <w:t xml:space="preserve">&gt;&gt; </w:t>
-      </w:r>
-      <w:r>
-        <w:rPr>
-          <w:rFonts w:ascii="Aptos" w:hAnsi="Aptos" w:cstheme="minorHAnsi"/>
-          <w:color w:val="404040" w:themeColor="text1" w:themeTint="BF"/>
-        </w:rPr>
-        <w:t>(Remote)</w:t>
+        <w:t xml:space="preserve">&lt;&lt;Company-Location-2&gt;&gt; (Remote)</w:t>
       </w:r>
     </w:p>
     <w:p>
       <w:pPr>
+        <w:keepNext/>
+        <w:keepLines/>
         <w:spacing w:beforeLines="20" w:before="48" w:afterLines="20" w:after="48"/>
-        <w:jc w:val="both"/>
+        <w:jc w:val="left"/>
         <w:rPr>
           <w:rFonts w:ascii="Aptos" w:hAnsi="Aptos" w:cstheme="minorHAnsi"/>
           <w:i/>
@@ -1242,140 +681,97 @@
     <w:p>
       <w:pPr>
         <w:pStyle w:val="ListParagraph"/>
+        <w:keepLines/>
         <w:numPr>
           <w:ilvl w:val="0"/>
           <w:numId w:val="14"/>
         </w:numPr>
         <w:ind w:left="180" w:hanging="180"/>
-        <w:jc w:val="both"/>
-        <w:rPr>
-          <w:rFonts w:ascii="Aptos" w:hAnsi="Aptos" w:cstheme="minorHAnsi"/>
-        </w:rPr>
-      </w:pPr>
-      <w:r>
-        <w:rPr>
-          <w:rFonts w:ascii="Aptos" w:hAnsi="Aptos" w:cstheme="minorHAnsi"/>
-        </w:rPr>
-        <w:t>&lt;&lt;Bullet-</w:t>
-      </w:r>
-      <w:r>
-        <w:rPr>
-          <w:rFonts w:ascii="Aptos" w:hAnsi="Aptos" w:cstheme="minorHAnsi"/>
-        </w:rPr>
-        <w:t>2</w:t>
-      </w:r>
-      <w:r>
-        <w:rPr>
-          <w:rFonts w:ascii="Aptos" w:hAnsi="Aptos" w:cstheme="minorHAnsi"/>
-        </w:rPr>
-        <w:t>-1&gt;&gt;</w:t>
+        <w:jc w:val="left"/>
+        <w:rPr>
+          <w:rFonts w:ascii="Aptos" w:hAnsi="Aptos" w:cstheme="minorHAnsi"/>
+        </w:rPr>
+      </w:pPr>
+      <w:r>
+        <w:rPr>
+          <w:rFonts w:ascii="Aptos" w:hAnsi="Aptos" w:cstheme="minorHAnsi"/>
+        </w:rPr>
+        <w:t>&lt;&lt;Bullet-2-1&gt;&gt;</w:t>
       </w:r>
     </w:p>
     <w:p>
       <w:pPr>
         <w:pStyle w:val="ListParagraph"/>
+        <w:keepLines/>
         <w:numPr>
           <w:ilvl w:val="0"/>
           <w:numId w:val="14"/>
         </w:numPr>
         <w:ind w:left="180" w:hanging="180"/>
-        <w:jc w:val="both"/>
-        <w:rPr>
-          <w:rFonts w:ascii="Aptos" w:hAnsi="Aptos" w:cstheme="minorHAnsi"/>
-        </w:rPr>
-      </w:pPr>
-      <w:r>
-        <w:rPr>
-          <w:rFonts w:ascii="Aptos" w:hAnsi="Aptos" w:cstheme="minorHAnsi"/>
-        </w:rPr>
-        <w:t>&lt;&lt;Bullet-</w:t>
-      </w:r>
-      <w:r>
-        <w:rPr>
-          <w:rFonts w:ascii="Aptos" w:hAnsi="Aptos" w:cstheme="minorHAnsi"/>
-        </w:rPr>
-        <w:t>2</w:t>
-      </w:r>
-      <w:r>
-        <w:rPr>
-          <w:rFonts w:ascii="Aptos" w:hAnsi="Aptos" w:cstheme="minorHAnsi"/>
-        </w:rPr>
-        <w:t>-2&gt;&gt;</w:t>
+        <w:jc w:val="left"/>
+        <w:rPr>
+          <w:rFonts w:ascii="Aptos" w:hAnsi="Aptos" w:cstheme="minorHAnsi"/>
+        </w:rPr>
+      </w:pPr>
+      <w:r>
+        <w:rPr>
+          <w:rFonts w:ascii="Aptos" w:hAnsi="Aptos" w:cstheme="minorHAnsi"/>
+        </w:rPr>
+        <w:t>&lt;&lt;Bullet-2-2&gt;&gt;</w:t>
       </w:r>
     </w:p>
     <w:p>
       <w:pPr>
         <w:pStyle w:val="ListParagraph"/>
+        <w:keepLines/>
         <w:numPr>
           <w:ilvl w:val="0"/>
           <w:numId w:val="14"/>
         </w:numPr>
         <w:ind w:left="180" w:hanging="180"/>
-        <w:jc w:val="both"/>
-        <w:rPr>
-          <w:rFonts w:ascii="Aptos" w:hAnsi="Aptos" w:cstheme="minorHAnsi"/>
-        </w:rPr>
-      </w:pPr>
-      <w:r>
-        <w:rPr>
-          <w:rFonts w:ascii="Aptos" w:hAnsi="Aptos" w:cstheme="minorHAnsi"/>
-        </w:rPr>
-        <w:t>&lt;&lt;Bullet-</w:t>
-      </w:r>
-      <w:r>
-        <w:rPr>
-          <w:rFonts w:ascii="Aptos" w:hAnsi="Aptos" w:cstheme="minorHAnsi"/>
-        </w:rPr>
-        <w:t>2</w:t>
-      </w:r>
-      <w:r>
-        <w:rPr>
-          <w:rFonts w:ascii="Aptos" w:hAnsi="Aptos" w:cstheme="minorHAnsi"/>
-        </w:rPr>
-        <w:t>-3&gt;&gt;</w:t>
+        <w:jc w:val="left"/>
+        <w:rPr>
+          <w:rFonts w:ascii="Aptos" w:hAnsi="Aptos" w:cstheme="minorHAnsi"/>
+        </w:rPr>
+      </w:pPr>
+      <w:r>
+        <w:rPr>
+          <w:rFonts w:ascii="Aptos" w:hAnsi="Aptos" w:cstheme="minorHAnsi"/>
+        </w:rPr>
+        <w:t>&lt;&lt;Bullet-2-3&gt;&gt;</w:t>
       </w:r>
     </w:p>
     <w:p>
       <w:pPr>
         <w:pStyle w:val="ListParagraph"/>
+        <w:keepLines/>
         <w:numPr>
           <w:ilvl w:val="0"/>
           <w:numId w:val="14"/>
         </w:numPr>
         <w:ind w:left="180" w:hanging="180"/>
-        <w:jc w:val="both"/>
-        <w:rPr>
-          <w:rFonts w:ascii="Aptos" w:hAnsi="Aptos" w:cstheme="minorHAnsi"/>
-        </w:rPr>
-      </w:pPr>
-      <w:r>
-        <w:rPr>
-          <w:rFonts w:ascii="Aptos" w:hAnsi="Aptos" w:cstheme="minorHAnsi"/>
-        </w:rPr>
-        <w:t>&lt;&lt;Bullet-</w:t>
-      </w:r>
-      <w:r>
-        <w:rPr>
-          <w:rFonts w:ascii="Aptos" w:hAnsi="Aptos" w:cstheme="minorHAnsi"/>
-        </w:rPr>
-        <w:t>2</w:t>
-      </w:r>
-      <w:r>
-        <w:rPr>
-          <w:rFonts w:ascii="Aptos" w:hAnsi="Aptos" w:cstheme="minorHAnsi"/>
-        </w:rPr>
-        <w:t>-4&gt;&gt;</w:t>
+        <w:jc w:val="left"/>
+        <w:rPr>
+          <w:rFonts w:ascii="Aptos" w:hAnsi="Aptos" w:cstheme="minorHAnsi"/>
+        </w:rPr>
+      </w:pPr>
+      <w:r>
+        <w:rPr>
+          <w:rFonts w:ascii="Aptos" w:hAnsi="Aptos" w:cstheme="minorHAnsi"/>
+        </w:rPr>
+        <w:t>&lt;&lt;Bullet-2-4&gt;&gt;</w:t>
       </w:r>
     </w:p>
     <w:p>
       <w:pPr>
         <w:pStyle w:val="ListParagraph"/>
+        <w:keepLines/>
         <w:numPr>
           <w:ilvl w:val="0"/>
           <w:numId w:val="14"/>
         </w:numPr>
         <w:ind w:left="180" w:hanging="180"/>
-        <w:jc w:val="both"/>
+        <w:jc w:val="left"/>
         <w:rPr>
           <w:rFonts w:ascii="Aptos" w:hAnsi="Aptos" w:cstheme="minorHAnsi"/>
         </w:rPr>
@@ -1390,51 +786,30 @@
     <w:p>
       <w:pPr>
         <w:pStyle w:val="ListParagraph"/>
+        <w:keepNext/>
+        <w:keepLines/>
         <w:numPr>
           <w:ilvl w:val="0"/>
           <w:numId w:val="14"/>
         </w:numPr>
         <w:ind w:left="180" w:hanging="180"/>
-        <w:jc w:val="both"/>
-        <w:rPr>
-          <w:rFonts w:ascii="Aptos" w:hAnsi="Aptos" w:cstheme="minorHAnsi"/>
-        </w:rPr>
-      </w:pPr>
-      <w:r>
-        <w:rPr>
-          <w:rFonts w:ascii="Aptos" w:hAnsi="Aptos" w:cstheme="minorHAnsi"/>
-        </w:rPr>
-        <w:t>&lt;&lt;Bullet-</w:t>
-      </w:r>
-      <w:r>
-        <w:rPr>
-          <w:rFonts w:ascii="Aptos" w:hAnsi="Aptos" w:cstheme="minorHAnsi"/>
-        </w:rPr>
-        <w:t>2</w:t>
-      </w:r>
-      <w:r>
-        <w:rPr>
-          <w:rFonts w:ascii="Aptos" w:hAnsi="Aptos" w:cstheme="minorHAnsi"/>
-        </w:rPr>
-        <w:t>-</w:t>
-      </w:r>
-      <w:r>
-        <w:rPr>
-          <w:rFonts w:ascii="Aptos" w:hAnsi="Aptos" w:cstheme="minorHAnsi"/>
-        </w:rPr>
-        <w:t>6</w:t>
-      </w:r>
-      <w:r>
-        <w:rPr>
-          <w:rFonts w:ascii="Aptos" w:hAnsi="Aptos" w:cstheme="minorHAnsi"/>
-        </w:rPr>
-        <w:t>&gt;&gt;</w:t>
+        <w:jc w:val="left"/>
+        <w:rPr>
+          <w:rFonts w:ascii="Aptos" w:hAnsi="Aptos" w:cstheme="minorHAnsi"/>
+        </w:rPr>
+      </w:pPr>
+      <w:r>
+        <w:rPr>
+          <w:rFonts w:ascii="Aptos" w:hAnsi="Aptos" w:cstheme="minorHAnsi"/>
+        </w:rPr>
+        <w:t>&lt;&lt;Bullet-2-6&gt;&gt;</w:t>
       </w:r>
     </w:p>
     <w:p>
       <w:pPr>
+        <w:keepLines/>
         <w:spacing w:beforeLines="20" w:before="48" w:afterLines="20" w:after="48"/>
-        <w:jc w:val="both"/>
+        <w:jc w:val="left"/>
         <w:rPr>
           <w:rFonts w:ascii="Aptos" w:hAnsi="Aptos" w:cstheme="minorHAnsi"/>
         </w:rPr>
@@ -1456,8 +831,10 @@
     </w:p>
     <w:p>
       <w:pPr>
+        <w:keepNext/>
+        <w:keepLines/>
         <w:tabs>
-          <w:tab w:val="right" w:pos="10800"/>
+          <w:tab w:val="right" w:pos="10754"/>
         </w:tabs>
         <w:spacing w:before="160" w:after="60"/>
         <w:rPr>
@@ -1470,15 +847,7 @@
           <w:b/>
           <w:bCs/>
         </w:rPr>
-        <w:t xml:space="preserve">Software Engineer </w:t>
-      </w:r>
-      <w:r>
-        <w:rPr>
-          <w:rFonts w:ascii="Aptos" w:hAnsi="Aptos" w:cstheme="minorHAnsi"/>
-          <w:b/>
-          <w:bCs/>
-        </w:rPr>
-        <w:t>(</w:t>
+        <w:t xml:space="preserve">Software Engineer (</w:t>
       </w:r>
       <w:r>
         <w:rPr>
@@ -1487,94 +856,28 @@
           <w:bCs/>
           <w:color w:val="404040" w:themeColor="text1" w:themeTint="BF"/>
         </w:rPr>
-        <w:t>&lt;&lt;Extra-Role-Title-</w:t>
+        <w:t>&lt;&lt;Extra-Role-Title-3&gt;&gt;</w:t>
       </w:r>
       <w:r>
         <w:rPr>
           <w:rFonts w:ascii="Aptos" w:hAnsi="Aptos" w:cstheme="minorHAnsi"/>
           <w:b/>
           <w:bCs/>
+        </w:rPr>
+        <w:t>)</w:t>
+      </w:r>
+      <w:r>
+        <w:rPr>
+          <w:rFonts w:ascii="Aptos" w:hAnsi="Aptos" w:cstheme="minorHAnsi"/>
+        </w:rPr>
+        <w:tab/>
+      </w:r>
+      <w:r>
+        <w:rPr>
+          <w:rFonts w:ascii="Aptos" w:hAnsi="Aptos" w:cstheme="minorHAnsi"/>
           <w:color w:val="404040" w:themeColor="text1" w:themeTint="BF"/>
         </w:rPr>
-        <w:t>3</w:t>
-      </w:r>
-      <w:r>
-        <w:rPr>
-          <w:rFonts w:ascii="Aptos" w:hAnsi="Aptos" w:cstheme="minorHAnsi"/>
-          <w:b/>
-          <w:bCs/>
-          <w:color w:val="404040" w:themeColor="text1" w:themeTint="BF"/>
-        </w:rPr>
-        <w:t>&gt;&gt;)</w:t>
-      </w:r>
-      <w:r>
-        <w:rPr>
-          <w:rFonts w:ascii="Aptos" w:hAnsi="Aptos" w:cstheme="minorHAnsi"/>
-        </w:rPr>
-        <w:tab/>
-      </w:r>
-      <w:r>
-        <w:rPr>
-          <w:rFonts w:ascii="Aptos" w:hAnsi="Aptos" w:cstheme="minorHAnsi"/>
-          <w:color w:val="404040" w:themeColor="text1" w:themeTint="BF"/>
-        </w:rPr>
-        <w:t>Jun</w:t>
-      </w:r>
-      <w:r>
-        <w:rPr>
-          <w:rFonts w:ascii="Aptos" w:hAnsi="Aptos" w:cstheme="minorHAnsi"/>
-          <w:color w:val="404040" w:themeColor="text1" w:themeTint="BF"/>
-        </w:rPr>
-        <w:t xml:space="preserve"> 201</w:t>
-      </w:r>
-      <w:r>
-        <w:rPr>
-          <w:rFonts w:ascii="Aptos" w:hAnsi="Aptos" w:cstheme="minorHAnsi"/>
-          <w:color w:val="404040" w:themeColor="text1" w:themeTint="BF"/>
-        </w:rPr>
-        <w:t>8</w:t>
-      </w:r>
-      <w:r>
-        <w:rPr>
-          <w:rFonts w:ascii="Aptos" w:hAnsi="Aptos" w:cstheme="minorHAnsi"/>
-          <w:color w:val="404040" w:themeColor="text1" w:themeTint="BF"/>
-        </w:rPr>
-        <w:t xml:space="preserve"> </w:t>
-      </w:r>
-      <w:r>
-        <w:rPr>
-          <w:rFonts w:ascii="Aptos" w:hAnsi="Aptos" w:cstheme="minorHAnsi"/>
-          <w:color w:val="404040" w:themeColor="text1" w:themeTint="BF"/>
-        </w:rPr>
-        <w:t xml:space="preserve">– </w:t>
-      </w:r>
-      <w:r>
-        <w:rPr>
-          <w:rFonts w:ascii="Aptos" w:hAnsi="Aptos" w:cstheme="minorHAnsi"/>
-          <w:color w:val="404040" w:themeColor="text1" w:themeTint="BF"/>
-        </w:rPr>
-        <w:t>Mar</w:t>
-      </w:r>
-      <w:r>
-        <w:rPr>
-          <w:rFonts w:ascii="Aptos" w:hAnsi="Aptos" w:cstheme="minorHAnsi"/>
-          <w:color w:val="404040" w:themeColor="text1" w:themeTint="BF"/>
-        </w:rPr>
-        <w:t xml:space="preserve"> </w:t>
-      </w:r>
-      <w:r>
-        <w:rPr>
-          <w:rFonts w:ascii="Aptos" w:hAnsi="Aptos" w:cstheme="minorHAnsi"/>
-          <w:color w:val="404040" w:themeColor="text1" w:themeTint="BF"/>
-        </w:rPr>
-        <w:t>20</w:t>
-      </w:r>
-      <w:r>
-        <w:rPr>
-          <w:rFonts w:ascii="Aptos" w:hAnsi="Aptos" w:cstheme="minorHAnsi"/>
-          <w:color w:val="404040" w:themeColor="text1" w:themeTint="BF"/>
-        </w:rPr>
-        <w:t>20</w:t>
+        <w:t xml:space="preserve">Jun 2018 – Mar 2020</w:t>
       </w:r>
       <w:r>
         <w:rPr>
@@ -1603,34 +906,15 @@
           <w:rFonts w:ascii="Aptos" w:hAnsi="Aptos" w:cstheme="minorHAnsi"/>
           <w:color w:val="404040" w:themeColor="text1" w:themeTint="BF"/>
         </w:rPr>
-        <w:t>&lt;&lt;Company-Location-</w:t>
-      </w:r>
-      <w:r>
-        <w:rPr>
-          <w:rFonts w:ascii="Aptos" w:hAnsi="Aptos" w:cstheme="minorHAnsi"/>
-          <w:color w:val="404040" w:themeColor="text1" w:themeTint="BF"/>
-        </w:rPr>
-        <w:t>3</w:t>
-      </w:r>
-      <w:r>
-        <w:rPr>
-          <w:rFonts w:ascii="Aptos" w:hAnsi="Aptos" w:cstheme="minorHAnsi"/>
-          <w:color w:val="404040" w:themeColor="text1" w:themeTint="BF"/>
-        </w:rPr>
-        <w:t xml:space="preserve">&gt;&gt; </w:t>
-      </w:r>
-      <w:r>
-        <w:rPr>
-          <w:rFonts w:ascii="Aptos" w:hAnsi="Aptos" w:cstheme="minorHAnsi"/>
-          <w:color w:val="404040" w:themeColor="text1" w:themeTint="BF"/>
-        </w:rPr>
-        <w:t>(Remote)</w:t>
+        <w:t xml:space="preserve">&lt;&lt;Company-Location-3&gt;&gt; (Remote)</w:t>
       </w:r>
     </w:p>
     <w:p>
       <w:pPr>
+        <w:keepNext/>
+        <w:keepLines/>
         <w:spacing w:beforeLines="20" w:before="48" w:afterLines="20" w:after="48"/>
-        <w:jc w:val="both"/>
+        <w:jc w:val="left"/>
         <w:rPr>
           <w:rFonts w:ascii="Aptos" w:hAnsi="Aptos" w:cstheme="minorHAnsi"/>
           <w:i/>
@@ -1651,167 +935,114 @@
     <w:p>
       <w:pPr>
         <w:pStyle w:val="ListParagraph"/>
+        <w:keepLines/>
         <w:numPr>
           <w:ilvl w:val="0"/>
           <w:numId w:val="14"/>
         </w:numPr>
         <w:ind w:left="180" w:hanging="180"/>
-        <w:jc w:val="both"/>
-        <w:rPr>
-          <w:rFonts w:ascii="Aptos" w:hAnsi="Aptos" w:cstheme="minorHAnsi"/>
-        </w:rPr>
-      </w:pPr>
-      <w:r>
-        <w:rPr>
-          <w:rFonts w:ascii="Aptos" w:hAnsi="Aptos" w:cstheme="minorHAnsi"/>
-        </w:rPr>
-        <w:t>&lt;&lt;Bullet-</w:t>
-      </w:r>
-      <w:r>
-        <w:rPr>
-          <w:rFonts w:ascii="Aptos" w:hAnsi="Aptos" w:cstheme="minorHAnsi"/>
-        </w:rPr>
-        <w:t>3</w:t>
-      </w:r>
-      <w:r>
-        <w:rPr>
-          <w:rFonts w:ascii="Aptos" w:hAnsi="Aptos" w:cstheme="minorHAnsi"/>
-        </w:rPr>
-        <w:t>-1&gt;&gt;</w:t>
+        <w:jc w:val="left"/>
+        <w:rPr>
+          <w:rFonts w:ascii="Aptos" w:hAnsi="Aptos" w:cstheme="minorHAnsi"/>
+        </w:rPr>
+      </w:pPr>
+      <w:r>
+        <w:rPr>
+          <w:rFonts w:ascii="Aptos" w:hAnsi="Aptos" w:cstheme="minorHAnsi"/>
+        </w:rPr>
+        <w:t>&lt;&lt;Bullet-3-1&gt;&gt;</w:t>
       </w:r>
     </w:p>
     <w:p>
       <w:pPr>
         <w:pStyle w:val="ListParagraph"/>
+        <w:keepLines/>
         <w:numPr>
           <w:ilvl w:val="0"/>
           <w:numId w:val="14"/>
         </w:numPr>
         <w:ind w:left="180" w:hanging="180"/>
-        <w:jc w:val="both"/>
-        <w:rPr>
-          <w:rFonts w:ascii="Aptos" w:hAnsi="Aptos" w:cstheme="minorHAnsi"/>
-        </w:rPr>
-      </w:pPr>
-      <w:r>
-        <w:rPr>
-          <w:rFonts w:ascii="Aptos" w:hAnsi="Aptos" w:cstheme="minorHAnsi"/>
-        </w:rPr>
-        <w:t>&lt;&lt;Bullet-</w:t>
-      </w:r>
-      <w:r>
-        <w:rPr>
-          <w:rFonts w:ascii="Aptos" w:hAnsi="Aptos" w:cstheme="minorHAnsi"/>
-        </w:rPr>
-        <w:t>3</w:t>
-      </w:r>
-      <w:r>
-        <w:rPr>
-          <w:rFonts w:ascii="Aptos" w:hAnsi="Aptos" w:cstheme="minorHAnsi"/>
-        </w:rPr>
-        <w:t>-2&gt;&gt;</w:t>
+        <w:jc w:val="left"/>
+        <w:rPr>
+          <w:rFonts w:ascii="Aptos" w:hAnsi="Aptos" w:cstheme="minorHAnsi"/>
+        </w:rPr>
+      </w:pPr>
+      <w:r>
+        <w:rPr>
+          <w:rFonts w:ascii="Aptos" w:hAnsi="Aptos" w:cstheme="minorHAnsi"/>
+        </w:rPr>
+        <w:t>&lt;&lt;Bullet-3-2&gt;&gt;</w:t>
       </w:r>
     </w:p>
     <w:p>
       <w:pPr>
         <w:pStyle w:val="ListParagraph"/>
+        <w:keepLines/>
         <w:numPr>
           <w:ilvl w:val="0"/>
           <w:numId w:val="14"/>
         </w:numPr>
         <w:ind w:left="180" w:hanging="180"/>
-        <w:jc w:val="both"/>
-        <w:rPr>
-          <w:rFonts w:ascii="Aptos" w:hAnsi="Aptos" w:cstheme="minorHAnsi"/>
-        </w:rPr>
-      </w:pPr>
-      <w:r>
-        <w:rPr>
-          <w:rFonts w:ascii="Aptos" w:hAnsi="Aptos" w:cstheme="minorHAnsi"/>
-        </w:rPr>
-        <w:t>&lt;&lt;Bullet-</w:t>
-      </w:r>
-      <w:r>
-        <w:rPr>
-          <w:rFonts w:ascii="Aptos" w:hAnsi="Aptos" w:cstheme="minorHAnsi"/>
-        </w:rPr>
-        <w:t>3</w:t>
-      </w:r>
-      <w:r>
-        <w:rPr>
-          <w:rFonts w:ascii="Aptos" w:hAnsi="Aptos" w:cstheme="minorHAnsi"/>
-        </w:rPr>
-        <w:t>-3&gt;&gt;</w:t>
+        <w:jc w:val="left"/>
+        <w:rPr>
+          <w:rFonts w:ascii="Aptos" w:hAnsi="Aptos" w:cstheme="minorHAnsi"/>
+        </w:rPr>
+      </w:pPr>
+      <w:r>
+        <w:rPr>
+          <w:rFonts w:ascii="Aptos" w:hAnsi="Aptos" w:cstheme="minorHAnsi"/>
+        </w:rPr>
+        <w:t>&lt;&lt;Bullet-3-3&gt;&gt;</w:t>
       </w:r>
     </w:p>
     <w:p>
       <w:pPr>
         <w:pStyle w:val="ListParagraph"/>
+        <w:keepLines/>
         <w:numPr>
           <w:ilvl w:val="0"/>
           <w:numId w:val="14"/>
         </w:numPr>
         <w:ind w:left="180" w:hanging="180"/>
-        <w:jc w:val="both"/>
-        <w:rPr>
-          <w:rFonts w:ascii="Aptos" w:hAnsi="Aptos" w:cstheme="minorHAnsi"/>
-        </w:rPr>
-      </w:pPr>
-      <w:r>
-        <w:rPr>
-          <w:rFonts w:ascii="Aptos" w:hAnsi="Aptos" w:cstheme="minorHAnsi"/>
-        </w:rPr>
-        <w:t>&lt;&lt;Bullet-</w:t>
-      </w:r>
-      <w:r>
-        <w:rPr>
-          <w:rFonts w:ascii="Aptos" w:hAnsi="Aptos" w:cstheme="minorHAnsi"/>
-        </w:rPr>
-        <w:t>3</w:t>
-      </w:r>
-      <w:r>
-        <w:rPr>
-          <w:rFonts w:ascii="Aptos" w:hAnsi="Aptos" w:cstheme="minorHAnsi"/>
-        </w:rPr>
-        <w:t>-4&gt;&gt;</w:t>
+        <w:jc w:val="left"/>
+        <w:rPr>
+          <w:rFonts w:ascii="Aptos" w:hAnsi="Aptos" w:cstheme="minorHAnsi"/>
+        </w:rPr>
+      </w:pPr>
+      <w:r>
+        <w:rPr>
+          <w:rFonts w:ascii="Aptos" w:hAnsi="Aptos" w:cstheme="minorHAnsi"/>
+        </w:rPr>
+        <w:t>&lt;&lt;Bullet-3-4&gt;&gt;</w:t>
       </w:r>
     </w:p>
     <w:p>
       <w:pPr>
         <w:pStyle w:val="ListParagraph"/>
+        <w:keepNext/>
+        <w:keepLines/>
         <w:numPr>
           <w:ilvl w:val="0"/>
           <w:numId w:val="14"/>
         </w:numPr>
         <w:ind w:left="180" w:hanging="180"/>
-        <w:jc w:val="both"/>
-        <w:rPr>
-          <w:rFonts w:ascii="Aptos" w:hAnsi="Aptos" w:cstheme="minorHAnsi"/>
-        </w:rPr>
-      </w:pPr>
-      <w:r>
-        <w:rPr>
-          <w:rFonts w:ascii="Aptos" w:hAnsi="Aptos" w:cstheme="minorHAnsi"/>
-        </w:rPr>
-        <w:t>&lt;&lt;Bullet-</w:t>
-      </w:r>
-      <w:r>
-        <w:rPr>
-          <w:rFonts w:ascii="Aptos" w:hAnsi="Aptos" w:cstheme="minorHAnsi"/>
-        </w:rPr>
-        <w:t>3</w:t>
-      </w:r>
-      <w:r>
-        <w:rPr>
-          <w:rFonts w:ascii="Aptos" w:hAnsi="Aptos" w:cstheme="minorHAnsi"/>
-        </w:rPr>
-        <w:t>-5&gt;&gt;</w:t>
+        <w:jc w:val="left"/>
+        <w:rPr>
+          <w:rFonts w:ascii="Aptos" w:hAnsi="Aptos" w:cstheme="minorHAnsi"/>
+        </w:rPr>
+      </w:pPr>
+      <w:r>
+        <w:rPr>
+          <w:rFonts w:ascii="Aptos" w:hAnsi="Aptos" w:cstheme="minorHAnsi"/>
+        </w:rPr>
+        <w:t>&lt;&lt;Bullet-3-5&gt;&gt;</w:t>
       </w:r>
     </w:p>
     <w:p>
       <w:pPr>
+        <w:keepLines/>
         <w:spacing w:beforeLines="20" w:before="48" w:afterLines="20" w:after="48"/>
-        <w:jc w:val="both"/>
+        <w:jc w:val="left"/>
         <w:rPr>
           <w:rFonts w:ascii="Aptos" w:hAnsi="Aptos" w:cstheme="minorHAnsi"/>
         </w:rPr>
@@ -1834,6 +1065,8 @@
     <w:p>
       <w:pPr>
         <w:pStyle w:val="Heading2"/>
+        <w:keepNext/>
+        <w:keepLines/>
         <w:pBdr>
           <w:bottom w:val="single" w:sz="4" w:space="0" w:color="auto"/>
         </w:pBdr>
@@ -1857,8 +1090,10 @@
     </w:p>
     <w:p>
       <w:pPr>
+        <w:keepNext/>
+        <w:keepLines/>
         <w:tabs>
-          <w:tab w:val="right" w:pos="10440"/>
+          <w:tab w:val="right" w:pos="10754"/>
         </w:tabs>
         <w:spacing w:before="60" w:after="20"/>
         <w:rPr>
@@ -1873,13 +1108,6 @@
           <w:bCs/>
         </w:rPr>
         <w:t>B.Eng. in Information Systems Technology and Design</w:t>
-      </w:r>
-      <w:r>
-        <w:rPr>
-          <w:rFonts w:ascii="Aptos" w:hAnsi="Aptos" w:cstheme="minorHAnsi"/>
-          <w:b/>
-          <w:bCs/>
-        </w:rPr>
         <w:tab/>
       </w:r>
       <w:r>
@@ -1887,62 +1115,14 @@
           <w:rFonts w:ascii="Aptos" w:hAnsi="Aptos" w:cstheme="minorHAnsi"/>
           <w:color w:val="404040" w:themeColor="text1" w:themeTint="BF"/>
         </w:rPr>
-        <w:t>Sep</w:t>
-      </w:r>
-      <w:r>
-        <w:rPr>
-          <w:rFonts w:ascii="Aptos" w:hAnsi="Aptos" w:cstheme="minorHAnsi"/>
-          <w:color w:val="404040" w:themeColor="text1" w:themeTint="BF"/>
-        </w:rPr>
-        <w:t xml:space="preserve"> 201</w:t>
-      </w:r>
-      <w:r>
-        <w:rPr>
-          <w:rFonts w:ascii="Aptos" w:hAnsi="Aptos" w:cstheme="minorHAnsi"/>
-          <w:color w:val="404040" w:themeColor="text1" w:themeTint="BF"/>
-        </w:rPr>
-        <w:t>4</w:t>
-      </w:r>
-      <w:r>
-        <w:rPr>
-          <w:rFonts w:ascii="Aptos" w:hAnsi="Aptos" w:cstheme="minorHAnsi"/>
-          <w:color w:val="404040" w:themeColor="text1" w:themeTint="BF"/>
-        </w:rPr>
-        <w:t xml:space="preserve"> –</w:t>
-      </w:r>
-      <w:r>
-        <w:rPr>
-          <w:rFonts w:ascii="Aptos" w:hAnsi="Aptos" w:cstheme="minorHAnsi"/>
-          <w:color w:val="404040" w:themeColor="text1" w:themeTint="BF"/>
-        </w:rPr>
-        <w:t xml:space="preserve"> </w:t>
-      </w:r>
-      <w:r>
-        <w:rPr>
-          <w:rFonts w:ascii="Aptos" w:hAnsi="Aptos" w:cstheme="minorHAnsi"/>
-          <w:color w:val="404040" w:themeColor="text1" w:themeTint="BF"/>
-        </w:rPr>
-        <w:t>May</w:t>
-      </w:r>
-      <w:r>
-        <w:rPr>
-          <w:rFonts w:ascii="Aptos" w:hAnsi="Aptos" w:cstheme="minorHAnsi"/>
-          <w:color w:val="404040" w:themeColor="text1" w:themeTint="BF"/>
-        </w:rPr>
-        <w:t xml:space="preserve"> 201</w:t>
-      </w:r>
-      <w:r>
-        <w:rPr>
-          <w:rFonts w:ascii="Aptos" w:hAnsi="Aptos" w:cstheme="minorHAnsi"/>
-          <w:color w:val="404040" w:themeColor="text1" w:themeTint="BF"/>
-        </w:rPr>
-        <w:t>8</w:t>
+        <w:t xml:space="preserve">Sep 2014 – May 2018</w:t>
       </w:r>
     </w:p>
     <w:p>
       <w:pPr>
+        <w:keepLines/>
         <w:tabs>
-          <w:tab w:val="right" w:pos="10440"/>
+          <w:tab w:val="right" w:pos="10754"/>
         </w:tabs>
         <w:spacing w:after="20"/>
         <w:rPr>
@@ -4572,7 +3752,7 @@
   <w:docDefaults>
     <w:rPrDefault>
       <w:rPr>
-        <w:rFonts w:ascii="Times New Roman" w:eastAsia="Times New Roman" w:hAnsi="Times New Roman" w:cs="Times New Roman"/>
+        <w:rFonts w:ascii="Aptos" w:eastAsia="Times New Roman" w:hAnsi="Aptos" w:cs="Aptos"/>
         <w:lang w:val="en-US" w:eastAsia="en-US" w:bidi="ar-SA"/>
       </w:rPr>
     </w:rPrDefault>
@@ -4960,6 +4140,9 @@
     <w:name w:val="Normal"/>
     <w:qFormat/>
     <w:rsid w:val="00222749"/>
+    <w:rPr>
+      <w:rFonts w:ascii="Aptos" w:hAnsi="Aptos" w:cs="Aptos"/>
+    </w:rPr>
   </w:style>
   <w:style w:type="paragraph" w:styleId="Heading1">
     <w:name w:val="heading 1"/>
@@ -4983,6 +4166,7 @@
       <w:outlineLvl w:val="1"/>
     </w:pPr>
     <w:rPr>
+      <w:rFonts w:ascii="Aptos" w:hAnsi="Aptos" w:cs="Aptos"/>
       <w:color w:val="2E74B5"/>
       <w:sz w:val="26"/>
       <w:szCs w:val="26"/>
@@ -5091,6 +4275,9 @@
   <w:style w:type="paragraph" w:styleId="ListParagraph">
     <w:name w:val="List Paragraph"/>
     <w:qFormat/>
+    <w:rPr>
+      <w:rFonts w:ascii="Aptos" w:hAnsi="Aptos" w:cs="Aptos"/>
+    </w:rPr>
   </w:style>
   <w:style w:type="character" w:styleId="Hyperlink">
     <w:name w:val="Hyperlink"/>

</xml_diff>